<commit_message>
Fase 14: ERS V2.1 revisada, README completo, comentarios de legibilidad y evidencia de pruebas
</commit_message>
<xml_diff>
--- a/docs/Documento-Testing.docx
+++ b/docs/Documento-Testing.docx
@@ -11485,7 +11485,7 @@
       </w:r>
     </w:p>
     <w:bookmarkEnd w:id="49"/>
-    <w:bookmarkStart w:id="52" w:name="resultados-de-ejecución"/>
+    <w:bookmarkStart w:id="53" w:name="resultados-de-ejecución"/>
     <w:p>
       <w:pPr>
         <w:pStyle w:val="Heading1"/>
@@ -11805,7 +11805,7 @@
               <w:jc w:val="left"/>
             </w:pPr>
             <w:r>
-              <w:t xml:space="preserve">Evidencia de un solo entorno</w:t>
+              <w:t xml:space="preserve">Evidencia de macOS; ver también la sección 9.3</w:t>
             </w:r>
           </w:p>
         </w:tc>
@@ -11878,11 +11878,20 @@
         <w:pStyle w:val="BodyText"/>
       </w:pPr>
       <w:r>
+        <w:t xml:space="preserve">Las ejecuciones hechas en la Mac</w:t>
+      </w:r>
+      <w:r>
+        <w:t xml:space="preserve"> </w:t>
+      </w:r>
+      <w:r>
         <w:rPr>
           <w:bCs/>
           <w:b/>
         </w:rPr>
-        <w:t xml:space="preserve">No se conserva una salida detallada de Karma posterior al commit</w:t>
+        <w:t xml:space="preserve">no conservaron la salida detallada</w:t>
+      </w:r>
+      <w:r>
+        <w:t xml:space="preserve">, por lo que este documento no transcribe la lista de pruebas de esas ejecuciones. Una salida detallada posterior a</w:t>
       </w:r>
       <w:r>
         <w:t xml:space="preserve"> </w:t>
@@ -11894,7 +11903,7 @@
         <w:t xml:space="preserve">2290d86</w:t>
       </w:r>
       <w:r>
-        <w:t xml:space="preserve">. Por eso este documento no incluye una captura de la lista de pruebas ni cifras de una nueva ejecución de cobertura.</w:t>
+        <w:t xml:space="preserve">, obtenida en otro entorno, se describe en la sección 9.3.</w:t>
       </w:r>
     </w:p>
     <w:bookmarkEnd w:id="50"/>
@@ -12084,7 +12093,40 @@
         <w:pStyle w:val="FirstParagraph"/>
       </w:pPr>
       <w:r>
-        <w:t xml:space="preserve">Con eso es razonable esperar que la cobertura del código de la aplicación siga siendo la misma,</w:t>
+        <w:t xml:space="preserve">Con eso es razonable esperar que la cobertura del código de la aplicación siga siendo la misma. Las cifras de la sección 10 corresponden a la ejecución anterior al commit; la sección 9.3 aporta una medición posterior, hecha en otro entorno, que coincide.</w:t>
+      </w:r>
+    </w:p>
+    <w:bookmarkEnd w:id="51"/>
+    <w:bookmarkStart w:id="52" w:name="X0b96b94234adcbd3b4a5af23455d65d534cd679"/>
+    <w:p>
+      <w:pPr>
+        <w:pStyle w:val="Heading2"/>
+      </w:pPr>
+      <w:r>
+        <w:t xml:space="preserve">9.3 Verificación adicional en otro entorno (Fase 14)</w:t>
+      </w:r>
+    </w:p>
+    <w:p>
+      <w:pPr>
+        <w:pStyle w:val="FirstParagraph"/>
+      </w:pPr>
+      <w:r>
+        <w:t xml:space="preserve">En la Fase 14 se ejecutó</w:t>
+      </w:r>
+      <w:r>
+        <w:t xml:space="preserve"> </w:t>
+      </w:r>
+      <w:r>
+        <w:rPr>
+          <w:rStyle w:val="VerbatimChar"/>
+        </w:rPr>
+        <w:t xml:space="preserve">npm run test:coverage</w:t>
+      </w:r>
+      <w:r>
+        <w:t xml:space="preserve"> </w:t>
+      </w:r>
+      <w:r>
+        <w:t xml:space="preserve">sobre una copia del proyecto en un entorno</w:t>
       </w:r>
       <w:r>
         <w:t xml:space="preserve"> </w:t>
@@ -12094,15 +12136,147 @@
           <w:bCs/>
           <w:b/>
         </w:rPr>
-        <w:t xml:space="preserve">pero no se afirma como una medición</w:t>
-      </w:r>
-      <w:r>
-        <w:t xml:space="preserve">: las cifras de la sección 10 corresponden a la ejecución anterior al commit.</w:t>
+        <w:t xml:space="preserve">Linux con Chrome Headless 153.0.0.0</w:t>
+      </w:r>
+      <w:r>
+        <w:t xml:space="preserve">, es decir,</w:t>
+      </w:r>
+      <w:r>
+        <w:t xml:space="preserve"> </w:t>
+      </w:r>
+      <w:r>
+        <w:rPr>
+          <w:bCs/>
+          <w:b/>
+        </w:rPr>
+        <w:t xml:space="preserve">no en la Mac del autor</w:t>
+      </w:r>
+      <w:r>
+        <w:t xml:space="preserve">. Fue después del commit</w:t>
+      </w:r>
+      <w:r>
+        <w:t xml:space="preserve"> </w:t>
+      </w:r>
+      <w:r>
+        <w:rPr>
+          <w:rStyle w:val="VerbatimChar"/>
+        </w:rPr>
+        <w:t xml:space="preserve">2290d86</w:t>
+      </w:r>
+      <w:r>
+        <w:t xml:space="preserve"> </w:t>
+      </w:r>
+      <w:r>
+        <w:t xml:space="preserve">y de ajustes de comentarios en 8 archivos de</w:t>
+      </w:r>
+      <w:r>
+        <w:t xml:space="preserve"> </w:t>
+      </w:r>
+      <w:r>
+        <w:rPr>
+          <w:rStyle w:val="VerbatimChar"/>
+        </w:rPr>
+        <w:t xml:space="preserve">src/</w:t>
+      </w:r>
+      <w:r>
+        <w:t xml:space="preserve"> </w:t>
+      </w:r>
+      <w:r>
+        <w:t xml:space="preserve">(sin cambios de lógica). Resultados:</w:t>
       </w:r>
     </w:p>
-    <w:bookmarkEnd w:id="51"/>
+    <w:p>
+      <w:pPr>
+        <w:numPr>
+          <w:ilvl w:val="0"/>
+          <w:numId w:val="1006"/>
+        </w:numPr>
+        <w:pStyle w:val="Compact"/>
+      </w:pPr>
+      <w:r>
+        <w:rPr>
+          <w:rStyle w:val="VerbatimChar"/>
+        </w:rPr>
+        <w:t xml:space="preserve">Executed 93 of 93 SUCCESS</w:t>
+      </w:r>
+      <w:r>
+        <w:t xml:space="preserve">.</w:t>
+      </w:r>
+    </w:p>
+    <w:p>
+      <w:pPr>
+        <w:numPr>
+          <w:ilvl w:val="0"/>
+          <w:numId w:val="1006"/>
+        </w:numPr>
+        <w:pStyle w:val="Compact"/>
+      </w:pPr>
+      <w:r>
+        <w:t xml:space="preserve">Cobertura: sentencias 96,18 %, ramas 90,69 %, funciones 95,83 % y líneas 95,85 %. Las filas de la tabla por archivo coinciden una a una con</w:t>
+      </w:r>
+      <w:r>
+        <w:t xml:space="preserve"> </w:t>
+      </w:r>
+      <w:r>
+        <w:rPr>
+          <w:rStyle w:val="VerbatimChar"/>
+        </w:rPr>
+        <w:t xml:space="preserve">docs/cobertura.txt</w:t>
+      </w:r>
+      <w:r>
+        <w:t xml:space="preserve">.</w:t>
+      </w:r>
+    </w:p>
+    <w:p>
+      <w:pPr>
+        <w:numPr>
+          <w:ilvl w:val="0"/>
+          <w:numId w:val="1006"/>
+        </w:numPr>
+        <w:pStyle w:val="Compact"/>
+      </w:pPr>
+      <w:r>
+        <w:t xml:space="preserve">La salida completa, con el nombre de cada prueba, está en</w:t>
+      </w:r>
+      <w:r>
+        <w:t xml:space="preserve"> </w:t>
+      </w:r>
+      <w:r>
+        <w:rPr>
+          <w:rStyle w:val="VerbatimChar"/>
+        </w:rPr>
+        <w:t xml:space="preserve">docs/evidencia/salida-karma-linux.txt</w:t>
+      </w:r>
+      <w:r>
+        <w:t xml:space="preserve">. Incluye avisos</w:t>
+      </w:r>
+      <w:r>
+        <w:t xml:space="preserve"> </w:t>
+      </w:r>
+      <w:r>
+        <w:rPr>
+          <w:rStyle w:val="VerbatimChar"/>
+        </w:rPr>
+        <w:t xml:space="preserve">WARN</w:t>
+      </w:r>
+      <w:r>
+        <w:t xml:space="preserve"> </w:t>
+      </w:r>
+      <w:r>
+        <w:t xml:space="preserve">de React Router sobre cambios futuros de la versión 7; son avisos de la librería, no fallas.</w:t>
+      </w:r>
+    </w:p>
+    <w:p>
+      <w:pPr>
+        <w:pStyle w:val="FirstParagraph"/>
+      </w:pPr>
+      <w:r>
+        <w:t xml:space="preserve">Esta ejecución no reemplaza las 10 de la Mac: las complementa con un segundo entorno y con la lista de pruebas por nombre.</w:t>
+      </w:r>
+    </w:p>
     <w:bookmarkEnd w:id="52"/>
-    <w:bookmarkStart w:id="57" w:name="cobertura"/>
+    <w:bookmarkEnd w:id="53"/>
+    <w:bookmarkStart w:id="58" w:name="cobertura"/>
     <w:p>
       <w:pPr>
         <w:pStyle w:val="Heading1"/>
@@ -12111,7 +12285,7 @@
         <w:t xml:space="preserve">10. Cobertura</w:t>
       </w:r>
     </w:p>
-    <w:bookmarkStart w:id="53" w:name="resumen-global"/>
+    <w:bookmarkStart w:id="54" w:name="resumen-global"/>
     <w:p>
       <w:pPr>
         <w:pStyle w:val="Heading2"/>
@@ -12390,8 +12564,8 @@
         </w:tc>
       </w:tr>
     </w:tbl>
-    <w:bookmarkEnd w:id="53"/>
-    <w:bookmarkStart w:id="54" w:name="por-carpeta"/>
+    <w:bookmarkEnd w:id="54"/>
+    <w:bookmarkStart w:id="55" w:name="por-carpeta"/>
     <w:p>
       <w:pPr>
         <w:pStyle w:val="Heading2"/>
@@ -13017,8 +13191,8 @@
         <w:t xml:space="preserve">: son las páginas, que combinan muchas condiciones.</w:t>
       </w:r>
     </w:p>
-    <w:bookmarkEnd w:id="54"/>
-    <w:bookmarkStart w:id="55" w:name="lo-que-no-se-cubre-y-por-qué"/>
+    <w:bookmarkEnd w:id="55"/>
+    <w:bookmarkStart w:id="56" w:name="lo-que-no-se-cubre-y-por-qué"/>
     <w:p>
       <w:pPr>
         <w:pStyle w:val="Heading2"/>
@@ -13992,8 +14166,8 @@
         </w:tc>
       </w:tr>
     </w:tbl>
-    <w:bookmarkEnd w:id="55"/>
-    <w:bookmarkStart w:id="56" w:name="qué-mide-la-cobertura-y-qué-no"/>
+    <w:bookmarkEnd w:id="56"/>
+    <w:bookmarkStart w:id="57" w:name="qué-mide-la-cobertura-y-qué-no"/>
     <w:p>
       <w:pPr>
         <w:pStyle w:val="Heading2"/>
@@ -14062,9 +14236,9 @@
         <w:t xml:space="preserve">).</w:t>
       </w:r>
     </w:p>
-    <w:bookmarkEnd w:id="56"/>
     <w:bookmarkEnd w:id="57"/>
-    <w:bookmarkStart w:id="62" w:name="Xe87d248f758851ff5ef6e41043c867c44fc2424"/>
+    <w:bookmarkEnd w:id="58"/>
+    <w:bookmarkStart w:id="63" w:name="Xe87d248f758851ff5ef6e41043c867c44fc2424"/>
     <w:p>
       <w:pPr>
         <w:pStyle w:val="Heading1"/>
@@ -14082,7 +14256,7 @@
         <w:t xml:space="preserve">localStorage</w:t>
       </w:r>
     </w:p>
-    <w:bookmarkStart w:id="58" w:name="qué-pasó-en-simple"/>
+    <w:bookmarkStart w:id="59" w:name="qué-pasó-en-simple"/>
     <w:p>
       <w:pPr>
         <w:pStyle w:val="Heading2"/>
@@ -14267,8 +14441,8 @@
         <w:t xml:space="preserve">, no del código.</w:t>
       </w:r>
     </w:p>
-    <w:bookmarkEnd w:id="58"/>
-    <w:bookmarkStart w:id="59" w:name="cómo-se-resolvió"/>
+    <w:bookmarkEnd w:id="59"/>
+    <w:bookmarkStart w:id="60" w:name="cómo-se-resolvió"/>
     <w:p>
       <w:pPr>
         <w:pStyle w:val="Heading2"/>
@@ -14465,7 +14639,7 @@
       <w:pPr>
         <w:numPr>
           <w:ilvl w:val="0"/>
-          <w:numId w:val="1006"/>
+          <w:numId w:val="1007"/>
         </w:numPr>
         <w:pStyle w:val="Compact"/>
       </w:pPr>
@@ -14487,7 +14661,7 @@
       <w:pPr>
         <w:numPr>
           <w:ilvl w:val="0"/>
-          <w:numId w:val="1006"/>
+          <w:numId w:val="1007"/>
         </w:numPr>
         <w:pStyle w:val="Compact"/>
       </w:pPr>
@@ -14503,7 +14677,7 @@
       <w:pPr>
         <w:numPr>
           <w:ilvl w:val="0"/>
-          <w:numId w:val="1006"/>
+          <w:numId w:val="1007"/>
         </w:numPr>
         <w:pStyle w:val="Compact"/>
       </w:pPr>
@@ -14522,7 +14696,7 @@
       <w:pPr>
         <w:numPr>
           <w:ilvl w:val="0"/>
-          <w:numId w:val="1006"/>
+          <w:numId w:val="1007"/>
         </w:numPr>
         <w:pStyle w:val="Compact"/>
       </w:pPr>
@@ -14560,8 +14734,8 @@
         <w:t xml:space="preserve">de ese archivo ya tenía la limpieza.</w:t>
       </w:r>
     </w:p>
-    <w:bookmarkEnd w:id="59"/>
-    <w:bookmarkStart w:id="60" w:name="verificación"/>
+    <w:bookmarkEnd w:id="60"/>
+    <w:bookmarkStart w:id="61" w:name="verificación"/>
     <w:p>
       <w:pPr>
         <w:pStyle w:val="Heading2"/>
@@ -14646,8 +14820,8 @@
         <w:t xml:space="preserve">.</w:t>
       </w:r>
     </w:p>
-    <w:bookmarkEnd w:id="60"/>
-    <w:bookmarkStart w:id="61" w:name="regla-que-queda"/>
+    <w:bookmarkEnd w:id="61"/>
+    <w:bookmarkStart w:id="62" w:name="regla-que-queda"/>
     <w:p>
       <w:pPr>
         <w:pStyle w:val="Heading2"/>
@@ -14718,9 +14892,9 @@
         <w:t xml:space="preserve">).</w:t>
       </w:r>
     </w:p>
-    <w:bookmarkEnd w:id="61"/>
     <w:bookmarkEnd w:id="62"/>
-    <w:bookmarkStart w:id="63" w:name="pruebas-manuales"/>
+    <w:bookmarkEnd w:id="63"/>
+    <w:bookmarkStart w:id="64" w:name="pruebas-manuales"/>
     <w:p>
       <w:pPr>
         <w:pStyle w:val="Heading1"/>
@@ -15278,8 +15452,8 @@
         </w:tc>
       </w:tr>
     </w:tbl>
-    <w:bookmarkEnd w:id="63"/>
-    <w:bookmarkStart w:id="64" w:name="análisis"/>
+    <w:bookmarkEnd w:id="64"/>
+    <w:bookmarkStart w:id="65" w:name="análisis"/>
     <w:p>
       <w:pPr>
         <w:pStyle w:val="Heading1"/>
@@ -15292,7 +15466,7 @@
       <w:pPr>
         <w:numPr>
           <w:ilvl w:val="0"/>
-          <w:numId w:val="1007"/>
+          <w:numId w:val="1008"/>
         </w:numPr>
         <w:pStyle w:val="Compact"/>
       </w:pPr>
@@ -15314,7 +15488,7 @@
       <w:pPr>
         <w:numPr>
           <w:ilvl w:val="0"/>
-          <w:numId w:val="1007"/>
+          <w:numId w:val="1008"/>
         </w:numPr>
         <w:pStyle w:val="Compact"/>
       </w:pPr>
@@ -15368,7 +15542,7 @@
       <w:pPr>
         <w:numPr>
           <w:ilvl w:val="0"/>
-          <w:numId w:val="1007"/>
+          <w:numId w:val="1008"/>
         </w:numPr>
         <w:pStyle w:val="Compact"/>
       </w:pPr>
@@ -15405,7 +15579,7 @@
       <w:pPr>
         <w:numPr>
           <w:ilvl w:val="0"/>
-          <w:numId w:val="1007"/>
+          <w:numId w:val="1008"/>
         </w:numPr>
         <w:pStyle w:val="Compact"/>
       </w:pPr>
@@ -15423,8 +15597,8 @@
         <w:t xml:space="preserve">No hay evidencia de funcionamiento en otros navegadores ni sistemas operativos, ni de rendimiento medido.</w:t>
       </w:r>
     </w:p>
-    <w:bookmarkEnd w:id="64"/>
-    <w:bookmarkStart w:id="65" w:name="Xb537dd5bf16bd6be16cfd89805de67ded7a2c88"/>
+    <w:bookmarkEnd w:id="65"/>
+    <w:bookmarkStart w:id="67" w:name="Xb537dd5bf16bd6be16cfd89805de67ded7a2c88"/>
     <w:p>
       <w:pPr>
         <w:pStyle w:val="Heading1"/>
@@ -16527,8 +16701,259 @@
         </w:tc>
       </w:tr>
     </w:tbl>
-    <w:bookmarkEnd w:id="65"/>
-    <w:bookmarkStart w:id="83" w:name="anexo-a.-listado-de-las-93-pruebas"/>
+    <w:bookmarkStart w:id="66" w:name="estado-de-los-hallazgos-tras-la-fase-14"/>
+    <w:p>
+      <w:pPr>
+        <w:pStyle w:val="Heading2"/>
+      </w:pPr>
+      <w:r>
+        <w:t xml:space="preserve">14.1 Estado de los hallazgos tras la Fase 14</w:t>
+      </w:r>
+    </w:p>
+    <w:tbl>
+      <w:tblPr>
+        <w:tblStyle w:val="Table"/>
+        <w:tblW w:type="pct" w:w="5000"/>
+        <w:tblLook w:firstRow="1" w:lastRow="0" w:firstColumn="0" w:lastColumn="0" w:noHBand="0" w:noVBand="0" w:val="0020"/>
+        <w:jc w:val="start"/>
+      </w:tblPr>
+      <w:tblGrid>
+        <w:gridCol w:w="3960"/>
+        <w:gridCol w:w="3960"/>
+      </w:tblGrid>
+      <w:tr>
+        <w:trPr>
+          <w:tblHeader w:val="true"/>
+        </w:trPr>
+        <w:tc>
+          <w:tcPr/>
+          <w:p>
+            <w:pPr>
+              <w:pStyle w:val="Compact"/>
+              <w:jc w:val="left"/>
+            </w:pPr>
+            <w:r>
+              <w:t xml:space="preserve">Hallazgos</w:t>
+            </w:r>
+          </w:p>
+        </w:tc>
+        <w:tc>
+          <w:tcPr/>
+          <w:p>
+            <w:pPr>
+              <w:pStyle w:val="Compact"/>
+              <w:jc w:val="left"/>
+            </w:pPr>
+            <w:r>
+              <w:t xml:space="preserve">Estado</w:t>
+            </w:r>
+          </w:p>
+        </w:tc>
+      </w:tr>
+      <w:tr>
+        <w:tc>
+          <w:tcPr/>
+          <w:p>
+            <w:pPr>
+              <w:pStyle w:val="Compact"/>
+              <w:jc w:val="left"/>
+            </w:pPr>
+            <w:r>
+              <w:t xml:space="preserve">H-01, H-02, H-05, H-06, H-07</w:t>
+            </w:r>
+          </w:p>
+        </w:tc>
+        <w:tc>
+          <w:tcPr/>
+          <w:p>
+            <w:pPr>
+              <w:pStyle w:val="Compact"/>
+              <w:jc w:val="left"/>
+            </w:pPr>
+            <w:r>
+              <w:t xml:space="preserve">La ERS V2.1 indica ahora</w:t>
+            </w:r>
+            <w:r>
+              <w:t xml:space="preserve"> </w:t>
+            </w:r>
+            <w:r>
+              <w:t xml:space="preserve">“</w:t>
+            </w:r>
+            <w:r>
+              <w:t xml:space="preserve">revisión de código</w:t>
+            </w:r>
+            <w:r>
+              <w:t xml:space="preserve">”</w:t>
+            </w:r>
+            <w:r>
+              <w:t xml:space="preserve"> </w:t>
+            </w:r>
+            <w:r>
+              <w:t xml:space="preserve">donde no hay prueba automática. No se agregaron pruebas.</w:t>
+            </w:r>
+          </w:p>
+        </w:tc>
+      </w:tr>
+      <w:tr>
+        <w:tc>
+          <w:tcPr/>
+          <w:p>
+            <w:pPr>
+              <w:pStyle w:val="Compact"/>
+              <w:jc w:val="left"/>
+            </w:pPr>
+            <w:r>
+              <w:t xml:space="preserve">H-03, H-04</w:t>
+            </w:r>
+          </w:p>
+        </w:tc>
+        <w:tc>
+          <w:tcPr/>
+          <w:p>
+            <w:pPr>
+              <w:pStyle w:val="Compact"/>
+              <w:jc w:val="left"/>
+            </w:pPr>
+            <w:r>
+              <w:t xml:space="preserve">RNF-09, RNF-10 y RNF-11 reformulados a lo comprobado.</w:t>
+            </w:r>
+          </w:p>
+        </w:tc>
+      </w:tr>
+      <w:tr>
+        <w:tc>
+          <w:tcPr/>
+          <w:p>
+            <w:pPr>
+              <w:pStyle w:val="Compact"/>
+              <w:jc w:val="left"/>
+            </w:pPr>
+            <w:r>
+              <w:t xml:space="preserve">H-08, H-09</w:t>
+            </w:r>
+          </w:p>
+        </w:tc>
+        <w:tc>
+          <w:tcPr/>
+          <w:p>
+            <w:pPr>
+              <w:pStyle w:val="Compact"/>
+              <w:jc w:val="left"/>
+            </w:pPr>
+            <w:r>
+              <w:t xml:space="preserve">Cifras con fuente declarada y referencia a este documento actualizada en la ERS.</w:t>
+            </w:r>
+          </w:p>
+        </w:tc>
+      </w:tr>
+      <w:tr>
+        <w:tc>
+          <w:tcPr/>
+          <w:p>
+            <w:pPr>
+              <w:pStyle w:val="Compact"/>
+              <w:jc w:val="left"/>
+            </w:pPr>
+            <w:r>
+              <w:t xml:space="preserve">H-10</w:t>
+            </w:r>
+          </w:p>
+        </w:tc>
+        <w:tc>
+          <w:tcPr/>
+          <w:p>
+            <w:pPr>
+              <w:pStyle w:val="Compact"/>
+              <w:jc w:val="left"/>
+            </w:pPr>
+            <w:r>
+              <w:t xml:space="preserve">Cubierto en parte por la sección 9.3 (otro entorno). Una salida de la Mac sigue siendo opcional.</w:t>
+            </w:r>
+          </w:p>
+        </w:tc>
+      </w:tr>
+      <w:tr>
+        <w:tc>
+          <w:tcPr/>
+          <w:p>
+            <w:pPr>
+              <w:pStyle w:val="Compact"/>
+              <w:jc w:val="left"/>
+            </w:pPr>
+            <w:r>
+              <w:t xml:space="preserve">H-11, H-12</w:t>
+            </w:r>
+          </w:p>
+        </w:tc>
+        <w:tc>
+          <w:tcPr/>
+          <w:p>
+            <w:pPr>
+              <w:pStyle w:val="Compact"/>
+              <w:jc w:val="left"/>
+            </w:pPr>
+            <w:r>
+              <w:t xml:space="preserve">Pendientes, de baja prioridad.</w:t>
+            </w:r>
+          </w:p>
+        </w:tc>
+      </w:tr>
+      <w:tr>
+        <w:tc>
+          <w:tcPr/>
+          <w:p>
+            <w:pPr>
+              <w:pStyle w:val="Compact"/>
+              <w:jc w:val="left"/>
+            </w:pPr>
+            <w:r>
+              <w:t xml:space="preserve">H-13</w:t>
+            </w:r>
+          </w:p>
+        </w:tc>
+        <w:tc>
+          <w:tcPr/>
+          <w:p>
+            <w:pPr>
+              <w:pStyle w:val="Compact"/>
+              <w:jc w:val="left"/>
+            </w:pPr>
+            <w:r>
+              <w:t xml:space="preserve">Se atiende al armar el ZIP de entrega.</w:t>
+            </w:r>
+          </w:p>
+        </w:tc>
+      </w:tr>
+      <w:tr>
+        <w:tc>
+          <w:tcPr/>
+          <w:p>
+            <w:pPr>
+              <w:pStyle w:val="Compact"/>
+              <w:jc w:val="left"/>
+            </w:pPr>
+            <w:r>
+              <w:t xml:space="preserve">H-14</w:t>
+            </w:r>
+          </w:p>
+        </w:tc>
+        <w:tc>
+          <w:tcPr/>
+          <w:p>
+            <w:pPr>
+              <w:pStyle w:val="Compact"/>
+              <w:jc w:val="left"/>
+            </w:pPr>
+            <w:r>
+              <w:t xml:space="preserve">Pendiente: consultarlo con el profesor.</w:t>
+            </w:r>
+          </w:p>
+        </w:tc>
+      </w:tr>
+    </w:tbl>
+    <w:bookmarkEnd w:id="66"/>
+    <w:bookmarkEnd w:id="67"/>
+    <w:bookmarkStart w:id="85" w:name="anexo-a.-listado-de-las-93-pruebas"/>
     <w:p>
       <w:pPr>
         <w:pStyle w:val="Heading1"/>
@@ -16590,7 +17015,7 @@
         <w:t xml:space="preserve">(conteo estático, no una ejecución). Total: 93 pruebas.</w:t>
       </w:r>
     </w:p>
-    <w:bookmarkStart w:id="66" w:name="admincrud.spec.jsx-10-pruebas"/>
+    <w:bookmarkStart w:id="68" w:name="admincrud.spec.jsx-10-pruebas"/>
     <w:p>
       <w:pPr>
         <w:pStyle w:val="Heading3"/>
@@ -17051,8 +17476,8 @@
         </w:tc>
       </w:tr>
     </w:tbl>
-    <w:bookmarkEnd w:id="66"/>
-    <w:bookmarkStart w:id="67" w:name="authcontext.spec.jsx-5-pruebas"/>
+    <w:bookmarkEnd w:id="68"/>
+    <w:bookmarkStart w:id="69" w:name="authcontext.spec.jsx-5-pruebas"/>
     <w:p>
       <w:pPr>
         <w:pStyle w:val="Heading3"/>
@@ -17323,8 +17748,8 @@
         </w:tc>
       </w:tr>
     </w:tbl>
-    <w:bookmarkEnd w:id="67"/>
-    <w:bookmarkStart w:id="68" w:name="barranavegacion.spec.jsx-5-pruebas"/>
+    <w:bookmarkEnd w:id="69"/>
+    <w:bookmarkStart w:id="70" w:name="barranavegacion.spec.jsx-5-pruebas"/>
     <w:p>
       <w:pPr>
         <w:pStyle w:val="Heading3"/>
@@ -17595,8 +18020,8 @@
         </w:tc>
       </w:tr>
     </w:tbl>
-    <w:bookmarkEnd w:id="68"/>
-    <w:bookmarkStart w:id="69" w:name="basededatos.spec.js-6-pruebas"/>
+    <w:bookmarkEnd w:id="70"/>
+    <w:bookmarkStart w:id="71" w:name="basededatos.spec.js-6-pruebas"/>
     <w:p>
       <w:pPr>
         <w:pStyle w:val="Heading3"/>
@@ -17905,8 +18330,8 @@
         </w:tc>
       </w:tr>
     </w:tbl>
-    <w:bookmarkEnd w:id="69"/>
-    <w:bookmarkStart w:id="70" w:name="carrito.spec.js-5-pruebas"/>
+    <w:bookmarkEnd w:id="71"/>
+    <w:bookmarkStart w:id="72" w:name="carrito.spec.js-5-pruebas"/>
     <w:p>
       <w:pPr>
         <w:pStyle w:val="Heading3"/>
@@ -18177,8 +18602,8 @@
         </w:tc>
       </w:tr>
     </w:tbl>
-    <w:bookmarkEnd w:id="70"/>
-    <w:bookmarkStart w:id="71" w:name="carritocontext.spec.jsx-3-pruebas"/>
+    <w:bookmarkEnd w:id="72"/>
+    <w:bookmarkStart w:id="73" w:name="carritocontext.spec.jsx-3-pruebas"/>
     <w:p>
       <w:pPr>
         <w:pStyle w:val="Heading3"/>
@@ -18373,8 +18798,8 @@
         </w:tc>
       </w:tr>
     </w:tbl>
-    <w:bookmarkEnd w:id="71"/>
-    <w:bookmarkStart w:id="72" w:name="carritoui.spec.jsx-10-pruebas"/>
+    <w:bookmarkEnd w:id="73"/>
+    <w:bookmarkStart w:id="74" w:name="carritoui.spec.jsx-10-pruebas"/>
     <w:p>
       <w:pPr>
         <w:pStyle w:val="Heading3"/>
@@ -18835,8 +19260,8 @@
         </w:tc>
       </w:tr>
     </w:tbl>
-    <w:bookmarkEnd w:id="72"/>
-    <w:bookmarkStart w:id="73" w:name="casoslimite.spec.jsx-7-pruebas"/>
+    <w:bookmarkEnd w:id="74"/>
+    <w:bookmarkStart w:id="75" w:name="casoslimite.spec.jsx-7-pruebas"/>
     <w:p>
       <w:pPr>
         <w:pStyle w:val="Heading3"/>
@@ -19219,8 +19644,8 @@
         </w:tc>
       </w:tr>
     </w:tbl>
-    <w:bookmarkEnd w:id="73"/>
-    <w:bookmarkStart w:id="74" w:name="checkout.spec.jsx-7-pruebas"/>
+    <w:bookmarkEnd w:id="75"/>
+    <w:bookmarkStart w:id="76" w:name="checkout.spec.jsx-7-pruebas"/>
     <w:p>
       <w:pPr>
         <w:pStyle w:val="Heading3"/>
@@ -19567,8 +19992,8 @@
         </w:tc>
       </w:tr>
     </w:tbl>
-    <w:bookmarkEnd w:id="74"/>
-    <w:bookmarkStart w:id="75" w:name="componentesproductos.spec.jsx-7-pruebas"/>
+    <w:bookmarkEnd w:id="76"/>
+    <w:bookmarkStart w:id="77" w:name="componentesproductos.spec.jsx-7-pruebas"/>
     <w:p>
       <w:pPr>
         <w:pStyle w:val="Heading3"/>
@@ -19915,8 +20340,8 @@
         </w:tc>
       </w:tr>
     </w:tbl>
-    <w:bookmarkEnd w:id="75"/>
-    <w:bookmarkStart w:id="76" w:name="filtros.spec.js-4-pruebas"/>
+    <w:bookmarkEnd w:id="77"/>
+    <w:bookmarkStart w:id="78" w:name="filtros.spec.js-4-pruebas"/>
     <w:p>
       <w:pPr>
         <w:pStyle w:val="Heading3"/>
@@ -20149,8 +20574,8 @@
         </w:tc>
       </w:tr>
     </w:tbl>
-    <w:bookmarkEnd w:id="76"/>
-    <w:bookmarkStart w:id="77" w:name="login.spec.jsx-6-pruebas"/>
+    <w:bookmarkEnd w:id="78"/>
+    <w:bookmarkStart w:id="79" w:name="login.spec.jsx-6-pruebas"/>
     <w:p>
       <w:pPr>
         <w:pStyle w:val="Heading3"/>
@@ -20459,8 +20884,8 @@
         </w:tc>
       </w:tr>
     </w:tbl>
-    <w:bookmarkEnd w:id="77"/>
-    <w:bookmarkStart w:id="78" w:name="paginainicio.spec.jsx-1-pruebas"/>
+    <w:bookmarkEnd w:id="79"/>
+    <w:bookmarkStart w:id="80" w:name="paginainicio.spec.jsx-1-pruebas"/>
     <w:p>
       <w:pPr>
         <w:pStyle w:val="Heading3"/>
@@ -20579,8 +21004,8 @@
         </w:tc>
       </w:tr>
     </w:tbl>
-    <w:bookmarkEnd w:id="78"/>
-    <w:bookmarkStart w:id="79" w:name="paginascatalogo.spec.jsx-3-pruebas"/>
+    <w:bookmarkEnd w:id="80"/>
+    <w:bookmarkStart w:id="81" w:name="paginascatalogo.spec.jsx-3-pruebas"/>
     <w:p>
       <w:pPr>
         <w:pStyle w:val="Heading3"/>
@@ -20775,8 +21200,8 @@
         </w:tc>
       </w:tr>
     </w:tbl>
-    <w:bookmarkEnd w:id="79"/>
-    <w:bookmarkStart w:id="80" w:name="precios.spec.js-5-pruebas"/>
+    <w:bookmarkEnd w:id="81"/>
+    <w:bookmarkStart w:id="82" w:name="precios.spec.js-5-pruebas"/>
     <w:p>
       <w:pPr>
         <w:pStyle w:val="Heading3"/>
@@ -21047,8 +21472,8 @@
         </w:tc>
       </w:tr>
     </w:tbl>
-    <w:bookmarkEnd w:id="80"/>
-    <w:bookmarkStart w:id="81" w:name="rutas.spec.jsx-2-pruebas"/>
+    <w:bookmarkEnd w:id="82"/>
+    <w:bookmarkStart w:id="83" w:name="rutas.spec.jsx-2-pruebas"/>
     <w:p>
       <w:pPr>
         <w:pStyle w:val="Heading3"/>
@@ -21205,8 +21630,8 @@
         </w:tc>
       </w:tr>
     </w:tbl>
-    <w:bookmarkEnd w:id="81"/>
-    <w:bookmarkStart w:id="82" w:name="validaciones.spec.js-7-pruebas"/>
+    <w:bookmarkEnd w:id="83"/>
+    <w:bookmarkStart w:id="84" w:name="validaciones.spec.js-7-pruebas"/>
     <w:p>
       <w:pPr>
         <w:pStyle w:val="Heading3"/>
@@ -21553,8 +21978,8 @@
         </w:tc>
       </w:tr>
     </w:tbl>
-    <w:bookmarkEnd w:id="82"/>
-    <w:bookmarkEnd w:id="83"/>
+    <w:bookmarkEnd w:id="84"/>
+    <w:bookmarkEnd w:id="85"/>
     <w:sectPr/>
   </w:body>
 </w:document>
@@ -21898,6 +22323,9 @@
     <w:abstractNumId w:val="991"/>
   </w:num>
   <w:num w:numId="1007">
+    <w:abstractNumId w:val="991"/>
+  </w:num>
+  <w:num w:numId="1008">
     <w:abstractNumId w:val="991"/>
   </w:num>
 </w:numbering>

</xml_diff>

<commit_message>
Fase 14: documento de testing cita la evidencia de la Mac
</commit_message>
<xml_diff>
--- a/docs/Documento-Testing.docx
+++ b/docs/Documento-Testing.docx
@@ -11739,6 +11739,92 @@
               <w:jc w:val="left"/>
             </w:pPr>
             <w:r>
+              <w:t xml:space="preserve">Ejecución con salida conservada en la Mac</w:t>
+            </w:r>
+          </w:p>
+        </w:tc>
+        <w:tc>
+          <w:tcPr/>
+          <w:p>
+            <w:pPr>
+              <w:pStyle w:val="Compact"/>
+              <w:jc w:val="left"/>
+            </w:pPr>
+            <w:r>
+              <w:rPr>
+                <w:rStyle w:val="VerbatimChar"/>
+              </w:rPr>
+              <w:t xml:space="preserve">Executed 93 of 93 SUCCESS</w:t>
+            </w:r>
+            <w:r>
+              <w:t xml:space="preserve"> </w:t>
+            </w:r>
+            <w:r>
+              <w:t xml:space="preserve">(</w:t>
+            </w:r>
+            <w:r>
+              <w:rPr>
+                <w:rStyle w:val="VerbatimChar"/>
+              </w:rPr>
+              <w:t xml:space="preserve">npm test</w:t>
+            </w:r>
+            <w:r>
+              <w:t xml:space="preserve">, 28-oct-2026, 16:37), con el nombre de cada prueba, en Chrome Headless 156.0.0.0 sobre Mac OS 10.15.7. Se hizo con el código de la Fase 14, que respecto de</w:t>
+            </w:r>
+            <w:r>
+              <w:t xml:space="preserve"> </w:t>
+            </w:r>
+            <w:r>
+              <w:rPr>
+                <w:rStyle w:val="VerbatimChar"/>
+              </w:rPr>
+              <w:t xml:space="preserve">2290d86</w:t>
+            </w:r>
+            <w:r>
+              <w:t xml:space="preserve"> </w:t>
+            </w:r>
+            <w:r>
+              <w:t xml:space="preserve">solo cambia comentarios.</w:t>
+            </w:r>
+          </w:p>
+        </w:tc>
+        <w:tc>
+          <w:tcPr/>
+          <w:p>
+            <w:pPr>
+              <w:pStyle w:val="Compact"/>
+              <w:jc w:val="left"/>
+            </w:pPr>
+            <w:r>
+              <w:rPr>
+                <w:rStyle w:val="VerbatimChar"/>
+              </w:rPr>
+              <w:t xml:space="preserve">docs/evidencia/salida-karma-mac.txt</w:t>
+            </w:r>
+          </w:p>
+        </w:tc>
+        <w:tc>
+          <w:tcPr/>
+          <w:p>
+            <w:pPr>
+              <w:pStyle w:val="Compact"/>
+              <w:jc w:val="left"/>
+            </w:pPr>
+            <w:r>
+              <w:t xml:space="preserve">Verificado manualmente (salida conservada)</w:t>
+            </w:r>
+          </w:p>
+        </w:tc>
+      </w:tr>
+      <w:tr>
+        <w:tc>
+          <w:tcPr/>
+          <w:p>
+            <w:pPr>
+              <w:pStyle w:val="Compact"/>
+              <w:jc w:val="left"/>
+            </w:pPr>
+            <w:r>
               <w:t xml:space="preserve">Navegador de las pruebas</w:t>
             </w:r>
           </w:p>
@@ -11751,7 +11837,19 @@
               <w:jc w:val="left"/>
             </w:pPr>
             <w:r>
-              <w:t xml:space="preserve">Chrome Headless 156.0.0.0 en Mac OS 10.15.7 (según el nombre de la carpeta</w:t>
+              <w:t xml:space="preserve">Chrome Headless 156.0.0.0 en Mac OS 10.15.7</w:t>
+            </w:r>
+          </w:p>
+        </w:tc>
+        <w:tc>
+          <w:tcPr/>
+          <w:p>
+            <w:pPr>
+              <w:pStyle w:val="Compact"/>
+              <w:jc w:val="left"/>
+            </w:pPr>
+            <w:r>
+              <w:t xml:space="preserve">Salida anterior y carpeta</w:t>
             </w:r>
             <w:r>
               <w:t xml:space="preserve"> </w:t>
@@ -11766,34 +11864,7 @@
               <w:t xml:space="preserve"> </w:t>
             </w:r>
             <w:r>
-              <w:t xml:space="preserve">generada)</w:t>
-            </w:r>
-          </w:p>
-        </w:tc>
-        <w:tc>
-          <w:tcPr/>
-          <w:p>
-            <w:pPr>
-              <w:pStyle w:val="Compact"/>
-              <w:jc w:val="left"/>
-            </w:pPr>
-            <w:r>
-              <w:t xml:space="preserve">Carpeta</w:t>
-            </w:r>
-            <w:r>
-              <w:t xml:space="preserve"> </w:t>
-            </w:r>
-            <w:r>
-              <w:rPr>
-                <w:rStyle w:val="VerbatimChar"/>
-              </w:rPr>
-              <w:t xml:space="preserve">coverage/</w:t>
-            </w:r>
-            <w:r>
-              <w:t xml:space="preserve"> </w:t>
-            </w:r>
-            <w:r>
-              <w:t xml:space="preserve">de la ejecución de cobertura de la Fase 11</w:t>
+              <w:t xml:space="preserve">de la Fase 11</w:t>
             </w:r>
           </w:p>
         </w:tc>
@@ -11878,20 +11949,31 @@
         <w:pStyle w:val="BodyText"/>
       </w:pPr>
       <w:r>
-        <w:t xml:space="preserve">Las ejecuciones hechas en la Mac</w:t>
+        <w:t xml:space="preserve">De las 10 ejecuciones consecutivas de la Mac no se conservó la salida. La única salida detallada de la Mac es la del 28-oct-2026 a las 16:37 (</w:t>
+      </w:r>
+      <w:r>
+        <w:rPr>
+          <w:rStyle w:val="VerbatimChar"/>
+        </w:rPr>
+        <w:t xml:space="preserve">docs/evidencia/salida-karma-mac.txt</w:t>
+      </w:r>
+      <w:r>
+        <w:t xml:space="preserve">), que es de</w:t>
       </w:r>
       <w:r>
         <w:t xml:space="preserve"> </w:t>
       </w:r>
       <w:r>
         <w:rPr>
-          <w:bCs/>
-          <w:b/>
+          <w:rStyle w:val="VerbatimChar"/>
         </w:rPr>
-        <w:t xml:space="preserve">no conservaron la salida detallada</w:t>
-      </w:r>
-      <w:r>
-        <w:t xml:space="preserve">, por lo que este documento no transcribe la lista de pruebas de esas ejecuciones. Una salida detallada posterior a</w:t>
+        <w:t xml:space="preserve">npm test</w:t>
+      </w:r>
+      <w:r>
+        <w:t xml:space="preserve"> </w:t>
+      </w:r>
+      <w:r>
+        <w:t xml:space="preserve">y por tanto no incluye cobertura. Una salida con cobertura posterior a</w:t>
       </w:r>
       <w:r>
         <w:t xml:space="preserve"> </w:t>
@@ -16867,7 +16949,46 @@
               <w:jc w:val="left"/>
             </w:pPr>
             <w:r>
-              <w:t xml:space="preserve">Cubierto en parte por la sección 9.3 (otro entorno). Una salida de la Mac sigue siendo opcional.</w:t>
+              <w:t xml:space="preserve">Resuelto para las pruebas: hay salida detallada de la Mac (</w:t>
+            </w:r>
+            <w:r>
+              <w:rPr>
+                <w:rStyle w:val="VerbatimChar"/>
+              </w:rPr>
+              <w:t xml:space="preserve">salida-karma-mac.txt</w:t>
+            </w:r>
+            <w:r>
+              <w:t xml:space="preserve">). La cobertura posterior a</w:t>
+            </w:r>
+            <w:r>
+              <w:t xml:space="preserve"> </w:t>
+            </w:r>
+            <w:r>
+              <w:rPr>
+                <w:rStyle w:val="VerbatimChar"/>
+              </w:rPr>
+              <w:t xml:space="preserve">2290d86</w:t>
+            </w:r>
+            <w:r>
+              <w:t xml:space="preserve"> </w:t>
+            </w:r>
+            <w:r>
+              <w:t xml:space="preserve">solo se midió en el entorno Linux de la sección 9.3; una salida de</w:t>
+            </w:r>
+            <w:r>
+              <w:t xml:space="preserve"> </w:t>
+            </w:r>
+            <w:r>
+              <w:rPr>
+                <w:rStyle w:val="VerbatimChar"/>
+              </w:rPr>
+              <w:t xml:space="preserve">npm run test:coverage</w:t>
+            </w:r>
+            <w:r>
+              <w:t xml:space="preserve"> </w:t>
+            </w:r>
+            <w:r>
+              <w:t xml:space="preserve">en la Mac es opcional.</w:t>
             </w:r>
           </w:p>
         </w:tc>

</xml_diff>

<commit_message>
Fase 14: informe del frontend y documentos finales con ambos autores
</commit_message>
<xml_diff>
--- a/docs/Documento-Testing.docx
+++ b/docs/Documento-Testing.docx
@@ -121,13 +121,49 @@
       <w:r>
         <w:t xml:space="preserve">Mendoza</w:t>
       </w:r>
+      <w:r>
+        <w:t xml:space="preserve"> </w:t>
+      </w:r>
+      <w:r>
+        <w:t xml:space="preserve">e</w:t>
+      </w:r>
+      <w:r>
+        <w:t xml:space="preserve"> </w:t>
+      </w:r>
+      <w:r>
+        <w:t xml:space="preserve">Isai</w:t>
+      </w:r>
+      <w:r>
+        <w:t xml:space="preserve"> </w:t>
+      </w:r>
+      <w:r>
+        <w:t xml:space="preserve">Sepulveda</w:t>
+      </w:r>
     </w:p>
     <w:p>
       <w:pPr>
         <w:pStyle w:val="Date"/>
       </w:pPr>
       <w:r>
-        <w:t xml:space="preserve">Octubre</w:t>
+        <w:t xml:space="preserve">29</w:t>
+      </w:r>
+      <w:r>
+        <w:t xml:space="preserve"> </w:t>
+      </w:r>
+      <w:r>
+        <w:t xml:space="preserve">de</w:t>
+      </w:r>
+      <w:r>
+        <w:t xml:space="preserve"> </w:t>
+      </w:r>
+      <w:r>
+        <w:t xml:space="preserve">octubre</w:t>
+      </w:r>
+      <w:r>
+        <w:t xml:space="preserve"> </w:t>
+      </w:r>
+      <w:r>
+        <w:t xml:space="preserve">de</w:t>
       </w:r>
       <w:r>
         <w:t xml:space="preserve"> </w:t>
@@ -149,7 +185,7 @@
             <w:pStyle w:val="TOCHeading"/>
           </w:pPr>
           <w:r>
-            <w:t xml:space="preserve">Table of Contents</w:t>
+            <w:t xml:space="preserve">Contenido</w:t>
           </w:r>
         </w:p>
         <w:p>
@@ -22512,7 +22548,7 @@
       <w:rFonts w:asciiTheme="majorHAnsi" w:cstheme="majorBidi" w:eastAsiaTheme="majorEastAsia" w:hAnsiTheme="majorHAnsi"/>
       <w:b/>
       <w:bCs/>
-      <w:color w:themeColor="accent1" w:themeShade="B5" w:val="345A8A"/>
+      <w:color w:val="000000"/>
       <w:sz w:val="36"/>
       <w:szCs w:val="36"/>
     </w:rPr>
@@ -22565,11 +22601,10 @@
       <w:spacing w:after="0" w:before="300"/>
     </w:pPr>
     <w:rPr>
+      <w:color w:val="000000"/>
       <w:sz w:val="20"/>
       <w:szCs w:val="20"/>
       <w:b/>
-      <w:color w:val="345A8A"/>
-      &gt;
     </w:rPr>
   </w:style>
   <w:style w:customStyle="1" w:styleId="Abstract" w:type="paragraph">
@@ -22611,7 +22646,7 @@
       <w:rFonts w:asciiTheme="majorHAnsi" w:cstheme="majorBidi" w:eastAsiaTheme="majorEastAsia" w:hAnsiTheme="majorHAnsi"/>
       <w:b/>
       <w:bCs/>
-      <w:color w:themeColor="accent1" w:val="4F81BD"/>
+      <w:color w:val="000000"/>
       <w:sz w:val="32"/>
       <w:szCs w:val="32"/>
     </w:rPr>
@@ -22633,7 +22668,7 @@
       <w:rFonts w:asciiTheme="majorHAnsi" w:cstheme="majorBidi" w:eastAsiaTheme="majorEastAsia" w:hAnsiTheme="majorHAnsi"/>
       <w:b/>
       <w:bCs/>
-      <w:color w:themeColor="accent1" w:val="4F81BD"/>
+      <w:color w:val="000000"/>
       <w:sz w:val="28"/>
       <w:szCs w:val="28"/>
     </w:rPr>
@@ -22655,7 +22690,7 @@
       <w:rFonts w:asciiTheme="majorHAnsi" w:cstheme="majorBidi" w:eastAsiaTheme="majorEastAsia" w:hAnsiTheme="majorHAnsi"/>
       <w:b/>
       <w:bCs/>
-      <w:color w:themeColor="accent1" w:val="4F81BD"/>
+      <w:color w:val="000000"/>
       <w:sz w:val="24"/>
       <w:szCs w:val="24"/>
     </w:rPr>
@@ -22677,7 +22712,7 @@
       <w:rFonts w:asciiTheme="majorHAnsi" w:cstheme="majorBidi" w:eastAsiaTheme="majorEastAsia" w:hAnsiTheme="majorHAnsi"/>
       <w:i/>
       <w:bCs/>
-      <w:color w:themeColor="accent1" w:val="4F81BD"/>
+      <w:color w:val="000000"/>
       <w:sz w:val="24"/>
       <w:szCs w:val="24"/>
     </w:rPr>
@@ -22698,7 +22733,7 @@
     <w:rPr>
       <w:rFonts w:asciiTheme="majorHAnsi" w:cstheme="majorBidi" w:eastAsiaTheme="majorEastAsia" w:hAnsiTheme="majorHAnsi"/>
       <w:iCs/>
-      <w:color w:themeColor="accent1" w:val="4F81BD"/>
+      <w:color w:val="000000"/>
       <w:sz w:val="24"/>
       <w:szCs w:val="24"/>
     </w:rPr>
@@ -22718,7 +22753,7 @@
     </w:pPr>
     <w:rPr>
       <w:rFonts w:asciiTheme="majorHAnsi" w:cstheme="majorBidi" w:eastAsiaTheme="majorEastAsia" w:hAnsiTheme="majorHAnsi"/>
-      <w:color w:themeColor="accent1" w:val="4F81BD"/>
+      <w:color w:val="000000"/>
       <w:sz w:val="24"/>
       <w:szCs w:val="24"/>
     </w:rPr>
@@ -22738,7 +22773,7 @@
     </w:pPr>
     <w:rPr>
       <w:rFonts w:asciiTheme="majorHAnsi" w:cstheme="majorBidi" w:eastAsiaTheme="majorEastAsia" w:hAnsiTheme="majorHAnsi"/>
-      <w:color w:themeColor="accent1" w:val="4F81BD"/>
+      <w:color w:val="000000"/>
       <w:sz w:val="24"/>
       <w:szCs w:val="24"/>
     </w:rPr>
@@ -22758,7 +22793,7 @@
     </w:pPr>
     <w:rPr>
       <w:rFonts w:asciiTheme="majorHAnsi" w:cstheme="majorBidi" w:eastAsiaTheme="majorEastAsia" w:hAnsiTheme="majorHAnsi"/>
-      <w:color w:themeColor="accent1" w:val="4F81BD"/>
+      <w:color w:val="000000"/>
       <w:sz w:val="24"/>
       <w:szCs w:val="24"/>
     </w:rPr>
@@ -22778,7 +22813,7 @@
     </w:pPr>
     <w:rPr>
       <w:rFonts w:asciiTheme="majorHAnsi" w:cstheme="majorBidi" w:eastAsiaTheme="majorEastAsia" w:hAnsiTheme="majorHAnsi"/>
-      <w:color w:themeColor="accent1" w:val="4F81BD"/>
+      <w:color w:val="000000"/>
       <w:sz w:val="24"/>
       <w:szCs w:val="24"/>
     </w:rPr>
@@ -22917,7 +22952,7 @@
     <w:name w:val="Hyperlink"/>
     <w:basedOn w:val="BodyTextChar"/>
     <w:rPr>
-      <w:color w:themeColor="accent1" w:val="4F81BD"/>
+      <w:color w:val="000000"/>
     </w:rPr>
   </w:style>
   <w:style w:styleId="TOCHeading" w:type="paragraph">
@@ -22935,7 +22970,7 @@
       <w:rFonts w:asciiTheme="majorHAnsi" w:cstheme="majorBidi" w:eastAsiaTheme="majorEastAsia" w:hAnsiTheme="majorHAnsi"/>
       <w:b w:val="0"/>
       <w:bCs w:val="0"/>
-      <w:color w:themeColor="accent1" w:themeShade="BF" w:val="365F91"/>
+      <w:color w:val="000000"/>
     </w:rPr>
   </w:style>
   <w:style w:type="paragraph" w:customStyle="1" w:styleId="SourceCode">
@@ -22950,7 +22985,6 @@
     <w:name w:val="KeywordTok"/>
     <w:basedOn w:val="VerbatimChar"/>
     <w:rPr>
-      <w:color w:val="007020"/>
       <w:b/>
     </w:rPr>
   </w:style>
@@ -22958,85 +22992,63 @@
     <w:name w:val="DataTypeTok"/>
     <w:basedOn w:val="VerbatimChar"/>
     <w:rPr>
-      <w:color w:val="902000"/>
+      <w:u/>
     </w:rPr>
   </w:style>
   <w:style w:type="character" w:customStyle="1" w:styleId="DecValTok">
     <w:name w:val="DecValTok"/>
     <w:basedOn w:val="VerbatimChar"/>
-    <w:rPr>
-      <w:color w:val="40a070"/>
-    </w:rPr>
+    <w:rPr/>
   </w:style>
   <w:style w:type="character" w:customStyle="1" w:styleId="BaseNTok">
     <w:name w:val="BaseNTok"/>
     <w:basedOn w:val="VerbatimChar"/>
-    <w:rPr>
-      <w:color w:val="40a070"/>
-    </w:rPr>
+    <w:rPr/>
   </w:style>
   <w:style w:type="character" w:customStyle="1" w:styleId="FloatTok">
     <w:name w:val="FloatTok"/>
     <w:basedOn w:val="VerbatimChar"/>
-    <w:rPr>
-      <w:color w:val="40a070"/>
-    </w:rPr>
+    <w:rPr/>
   </w:style>
   <w:style w:type="character" w:customStyle="1" w:styleId="ConstantTok">
     <w:name w:val="ConstantTok"/>
     <w:basedOn w:val="VerbatimChar"/>
-    <w:rPr>
-      <w:color w:val="880000"/>
-    </w:rPr>
+    <w:rPr/>
   </w:style>
   <w:style w:type="character" w:customStyle="1" w:styleId="CharTok">
     <w:name w:val="CharTok"/>
     <w:basedOn w:val="VerbatimChar"/>
-    <w:rPr>
-      <w:color w:val="4070a0"/>
-    </w:rPr>
+    <w:rPr/>
   </w:style>
   <w:style w:type="character" w:customStyle="1" w:styleId="SpecialCharTok">
     <w:name w:val="SpecialCharTok"/>
     <w:basedOn w:val="VerbatimChar"/>
-    <w:rPr>
-      <w:color w:val="4070a0"/>
-    </w:rPr>
+    <w:rPr/>
   </w:style>
   <w:style w:type="character" w:customStyle="1" w:styleId="StringTok">
     <w:name w:val="StringTok"/>
     <w:basedOn w:val="VerbatimChar"/>
-    <w:rPr>
-      <w:color w:val="4070a0"/>
-    </w:rPr>
+    <w:rPr/>
   </w:style>
   <w:style w:type="character" w:customStyle="1" w:styleId="VerbatimStringTok">
     <w:name w:val="VerbatimStringTok"/>
     <w:basedOn w:val="VerbatimChar"/>
-    <w:rPr>
-      <w:color w:val="4070a0"/>
-    </w:rPr>
+    <w:rPr/>
   </w:style>
   <w:style w:type="character" w:customStyle="1" w:styleId="SpecialStringTok">
     <w:name w:val="SpecialStringTok"/>
     <w:basedOn w:val="VerbatimChar"/>
-    <w:rPr>
-      <w:color w:val="bb6688"/>
-    </w:rPr>
+    <w:rPr/>
   </w:style>
   <w:style w:type="character" w:customStyle="1" w:styleId="ImportTok">
     <w:name w:val="ImportTok"/>
     <w:basedOn w:val="VerbatimChar"/>
-    <w:rPr>
-      <w:color w:val="008000"/>
-      <w:b/>
-    </w:rPr>
+    <w:rPr/>
   </w:style>
   <w:style w:type="character" w:customStyle="1" w:styleId="CommentTok">
     <w:name w:val="CommentTok"/>
     <w:basedOn w:val="VerbatimChar"/>
     <w:rPr>
-      <w:color w:val="60a0b0"/>
       <w:i/>
     </w:rPr>
   </w:style>
@@ -23044,7 +23056,6 @@
     <w:name w:val="DocumentationTok"/>
     <w:basedOn w:val="VerbatimChar"/>
     <w:rPr>
-      <w:color w:val="ba2121"/>
       <w:i/>
     </w:rPr>
   </w:style>
@@ -23052,8 +23063,6 @@
     <w:name w:val="AnnotationTok"/>
     <w:basedOn w:val="VerbatimChar"/>
     <w:rPr>
-      <w:color w:val="60a0b0"/>
-      <w:b/>
       <w:i/>
     </w:rPr>
   </w:style>
@@ -23061,53 +23070,40 @@
     <w:name w:val="CommentVarTok"/>
     <w:basedOn w:val="VerbatimChar"/>
     <w:rPr>
-      <w:color w:val="60a0b0"/>
-      <w:b/>
       <w:i/>
     </w:rPr>
   </w:style>
   <w:style w:type="character" w:customStyle="1" w:styleId="OtherTok">
     <w:name w:val="OtherTok"/>
     <w:basedOn w:val="VerbatimChar"/>
-    <w:rPr>
-      <w:color w:val="007020"/>
-    </w:rPr>
+    <w:rPr/>
   </w:style>
   <w:style w:type="character" w:customStyle="1" w:styleId="FunctionTok">
     <w:name w:val="FunctionTok"/>
     <w:basedOn w:val="VerbatimChar"/>
-    <w:rPr>
-      <w:color w:val="06287e"/>
-    </w:rPr>
+    <w:rPr/>
   </w:style>
   <w:style w:type="character" w:customStyle="1" w:styleId="VariableTok">
     <w:name w:val="VariableTok"/>
     <w:basedOn w:val="VerbatimChar"/>
-    <w:rPr>
-      <w:color w:val="19177c"/>
-    </w:rPr>
+    <w:rPr/>
   </w:style>
   <w:style w:type="character" w:customStyle="1" w:styleId="ControlFlowTok">
     <w:name w:val="ControlFlowTok"/>
     <w:basedOn w:val="VerbatimChar"/>
     <w:rPr>
-      <w:color w:val="007020"/>
       <w:b/>
     </w:rPr>
   </w:style>
   <w:style w:type="character" w:customStyle="1" w:styleId="OperatorTok">
     <w:name w:val="OperatorTok"/>
     <w:basedOn w:val="VerbatimChar"/>
-    <w:rPr>
-      <w:color w:val="666666"/>
-    </w:rPr>
+    <w:rPr/>
   </w:style>
   <w:style w:type="character" w:customStyle="1" w:styleId="BuiltInTok">
     <w:name w:val="BuiltInTok"/>
     <w:basedOn w:val="VerbatimChar"/>
-    <w:rPr>
-      <w:color w:val="008000"/>
-    </w:rPr>
+    <w:rPr/>
   </w:style>
   <w:style w:type="character" w:customStyle="1" w:styleId="ExtensionTok">
     <w:name w:val="ExtensionTok"/>
@@ -23118,15 +23114,13 @@
     <w:name w:val="PreprocessorTok"/>
     <w:basedOn w:val="VerbatimChar"/>
     <w:rPr>
-      <w:color w:val="bc7a00"/>
+      <w:b/>
     </w:rPr>
   </w:style>
   <w:style w:type="character" w:customStyle="1" w:styleId="AttributeTok">
     <w:name w:val="AttributeTok"/>
     <w:basedOn w:val="VerbatimChar"/>
-    <w:rPr>
-      <w:color w:val="7d9029"/>
-    </w:rPr>
+    <w:rPr/>
   </w:style>
   <w:style w:type="character" w:customStyle="1" w:styleId="RegionMarkerTok">
     <w:name w:val="RegionMarkerTok"/>
@@ -23137,8 +23131,6 @@
     <w:name w:val="InformationTok"/>
     <w:basedOn w:val="VerbatimChar"/>
     <w:rPr>
-      <w:color w:val="60a0b0"/>
-      <w:b/>
       <w:i/>
     </w:rPr>
   </w:style>
@@ -23146,8 +23138,6 @@
     <w:name w:val="WarningTok"/>
     <w:basedOn w:val="VerbatimChar"/>
     <w:rPr>
-      <w:color w:val="60a0b0"/>
-      <w:b/>
       <w:i/>
     </w:rPr>
   </w:style>
@@ -23155,7 +23145,6 @@
     <w:name w:val="AlertTok"/>
     <w:basedOn w:val="VerbatimChar"/>
     <w:rPr>
-      <w:color w:val="ff0000"/>
       <w:b/>
     </w:rPr>
   </w:style>
@@ -23163,7 +23152,6 @@
     <w:name w:val="ErrorTok"/>
     <w:basedOn w:val="VerbatimChar"/>
     <w:rPr>
-      <w:color w:val="ff0000"/>
       <w:b/>
     </w:rPr>
   </w:style>

</xml_diff>